<commit_message>
feat: add WeChat membership payments and sync content
</commit_message>
<xml_diff>
--- a/content/换届选举/2026-07-25-material-13iiu3q/template.docx
+++ b/content/换届选举/2026-07-25-material-13iiu3q/template.docx
@@ -8,6 +8,14 @@
         <w:ind w:left="0" w:firstLine="0"/>
         <w:jc w:val="center"/>
       </w:pPr>
+      <w:r>
+        <w:rPr>
+          <w:rFonts w:ascii="方正小标宋简体" w:hAnsi="方正小标宋简体" w:eastAsia="方正小标宋简体" w:cs="方正小标宋简体"/>
+          <w:b w:val="0"/>
+          <w:sz w:val="44"/>
+        </w:rPr>
+        <w:t>换届选举材料（八） | 候选人的请示</w:t>
+      </w:r>
       <w:bookmarkStart w:id="2" w:name="_GoBack"/>
       <w:bookmarkEnd w:id="2"/>
       <w:r>
@@ -16,7 +24,7 @@
           <w:b w:val="0"/>
           <w:sz w:val="44"/>
         </w:rPr>
-        <w:t>换届选举材料（八） | 候选人的请示参考（第二次请示）</w:t>
+        <w:t>（第二次请示）</w:t>
       </w:r>
     </w:p>
     <w:p>
@@ -472,7 +480,7 @@
     <w:lsdException w:qFormat="1" w:unhideWhenUsed="0" w:uiPriority="0" w:semiHidden="0" w:name="Title"/>
     <w:lsdException w:unhideWhenUsed="0" w:uiPriority="0" w:semiHidden="0" w:name="Closing"/>
     <w:lsdException w:unhideWhenUsed="0" w:uiPriority="0" w:semiHidden="0" w:name="Signature"/>
-    <w:lsdException w:unhideWhenUsed="0" w:uiPriority="0" w:name="Default Paragraph Font"/>
+    <w:lsdException w:qFormat="1" w:unhideWhenUsed="0" w:uiPriority="0" w:name="Default Paragraph Font"/>
     <w:lsdException w:unhideWhenUsed="0" w:uiPriority="0" w:semiHidden="0" w:name="Body Text"/>
     <w:lsdException w:unhideWhenUsed="0" w:uiPriority="0" w:semiHidden="0" w:name="Body Text Indent"/>
     <w:lsdException w:unhideWhenUsed="0" w:uiPriority="0" w:semiHidden="0" w:name="List Continue"/>
@@ -673,6 +681,7 @@
   <w:style w:type="character" w:default="1" w:styleId="3">
     <w:name w:val="Default Paragraph Font"/>
     <w:semiHidden/>
+    <w:qFormat/>
     <w:uiPriority w:val="0"/>
   </w:style>
   <w:style w:type="table" w:default="1" w:styleId="2">

</xml_diff>